<commit_message>
Checkpoint teaching decks, assessments and holiday camp materials
</commit_message>
<xml_diff>
--- a/DataAnalysis_Track/DataAnalysis_Glossary.docx
+++ b/DataAnalysis_Track/DataAnalysis_Glossary.docx
@@ -2222,7 +2222,7 @@
                 <w:rFonts w:ascii="Calibri" w:hAnsi="Calibri"/>
                 <w:sz w:val="17"/>
               </w:rPr>
-              <w:t>A separate table with one row per date. Without one, your months sort alphabetically.</w:t>
+              <w:t>A table with one row per date for consistent time filtering. Sort month names by month number.</w:t>
             </w:r>
           </w:p>
         </w:tc>
@@ -13790,7 +13790,7 @@
                 <w:rFonts w:ascii="Calibri" w:hAnsi="Calibri"/>
                 <w:sz w:val="16"/>
               </w:rPr>
-              <w:t>A separate table with one row per date. Without one, your months sort alphabetically.</w:t>
+              <w:t>A table with one row per date for consistent time filtering. Sort month names by month number.</w:t>
             </w:r>
           </w:p>
         </w:tc>

</xml_diff>